<commit_message>
Regenerate the sample reports and the demo GIF for the renamed own-case-ID check
docs/sample comes from the demo artifact of CI run 41051796291.

Co-Authored-By: Claude Opus 5.5 <noreply@anthropic.com>
</commit_message>
<xml_diff>
--- a/docs/sample/SYN-2026-006/SYN-2026-006-short-report-DRAFT.docx
+++ b/docs/sample/SYN-2026-006/SYN-2026-006-short-report-DRAFT.docx
@@ -131,7 +131,7 @@
               <w:pStyle w:val="TableText"/>
             </w:pPr>
             <w:r>
-              <w:t xml:space="preserve">20261030T095212Z-0d886d</w:t>
+              <w:t xml:space="preserve">20261030T115829Z-9196ec</w:t>
             </w:r>
           </w:p>
         </w:tc>
@@ -159,7 +159,7 @@
               <w:pStyle w:val="TableText"/>
             </w:pPr>
             <w:r>
-              <w:t xml:space="preserve">2026-10-30 09:52:12</w:t>
+              <w:t xml:space="preserve">2026-10-30 11:58:29</w:t>
             </w:r>
           </w:p>
         </w:tc>
@@ -1249,7 +1249,7 @@
               <w:pStyle w:val="TableText"/>
             </w:pPr>
             <w:r>
-              <w:t xml:space="preserve">Report cites its own case ID</w:t>
+              <w:t xml:space="preserve">Report names its own case ID</w:t>
             </w:r>
           </w:p>
         </w:tc>

</xml_diff>

<commit_message>
Run the live Copilot path without foreground, clipboard or a drawn desktop (#8)
Co-Authored-By: Claude Opus 5.5 <noreply@anthropic.com>
</commit_message>
<xml_diff>
--- a/docs/sample/SYN-2026-006/SYN-2026-006-short-report-DRAFT.docx
+++ b/docs/sample/SYN-2026-006/SYN-2026-006-short-report-DRAFT.docx
@@ -131,7 +131,7 @@
               <w:pStyle w:val="TableText"/>
             </w:pPr>
             <w:r>
-              <w:t xml:space="preserve">20261030T095212Z-0d886d</w:t>
+              <w:t xml:space="preserve">20261030T115829Z-9196ec</w:t>
             </w:r>
           </w:p>
         </w:tc>
@@ -159,7 +159,7 @@
               <w:pStyle w:val="TableText"/>
             </w:pPr>
             <w:r>
-              <w:t xml:space="preserve">2026-10-30 09:52:12</w:t>
+              <w:t xml:space="preserve">2026-10-30 11:58:29</w:t>
             </w:r>
           </w:p>
         </w:tc>
@@ -1249,7 +1249,7 @@
               <w:pStyle w:val="TableText"/>
             </w:pPr>
             <w:r>
-              <w:t xml:space="preserve">Report cites its own case ID</w:t>
+              <w:t xml:space="preserve">Report names its own case ID</w:t>
             </w:r>
           </w:p>
         </w:tc>

</xml_diff>